<commit_message>
Regenerate the annual load/PV/wind profile figure for the diesel-hybrid baseline
outputs/figures/01_annual_profile.png was a leftover from the completed
off-grid study (1.6 GWh/year, no diesel) -- still present in the figures
directory and stale relative to the current baseline even though the
rewritten report no longer referenced it directly. Regenerated it against
the actual current baseline config (4.5 GWh/year load, 1,200 kW peak,
diesel backup) via scripts/diesel_hybrid_demo.py, which already computes
this load/PV/wind data for its other figures, and added it to the
technical report's system description section.
</commit_message>
<xml_diff>
--- a/v2/reports/exports/technical_report.docx
+++ b/v2/reports/exports/technical_report.docx
@@ -36,7 +36,7 @@
         </w:p>
       </w:sdtContent>
     </w:sdt>
-    <w:bookmarkStart w:id="73" w:name="X320dbef72c152cb8a69731335d4bee1c5c3117e"/>
+    <w:bookmarkStart w:id="76" w:name="X320dbef72c152cb8a69731335d4bee1c5c3117e"/>
     <w:p>
       <w:pPr>
         <w:pStyle w:val="Heading1"/>
@@ -501,7 +501,7 @@
       </w:r>
     </w:p>
     <w:bookmarkEnd w:id="21"/>
-    <w:bookmarkStart w:id="22" w:name="system-description"/>
+    <w:bookmarkStart w:id="25" w:name="system-description"/>
     <w:p>
       <w:pPr>
         <w:pStyle w:val="Heading2"/>
@@ -660,8 +660,63 @@
         <w:t xml:space="preserve">sit idle (§8 shows the sensitivity of this choice).</w:t>
       </w:r>
     </w:p>
-    <w:bookmarkEnd w:id="22"/>
-    <w:bookmarkStart w:id="23" w:name="weather-and-load-data"/>
+    <w:p>
+      <w:pPr>
+        <w:pStyle w:val="CaptionedFigure"/>
+      </w:pPr>
+      <w:r>
+        <w:drawing>
+          <wp:inline>
+            <wp:extent cx="5334000" cy="1747112"/>
+            <wp:effectExtent b="0" l="0" r="0" t="0"/>
+            <wp:docPr descr="Annual load, PV, and wind profile at the baseline case (Jinan, 2023)" title="" id="23" name="Picture"/>
+            <a:graphic>
+              <a:graphicData uri="http://schemas.openxmlformats.org/drawingml/2006/picture">
+                <pic:pic>
+                  <pic:nvPicPr>
+                    <pic:cNvPr descr="../outputs/figures/01_annual_profile.png" id="24" name="Picture"/>
+                    <pic:cNvPicPr>
+                      <a:picLocks noChangeArrowheads="1" noChangeAspect="1"/>
+                    </pic:cNvPicPr>
+                  </pic:nvPicPr>
+                  <pic:blipFill>
+                    <a:blip r:embed="rId22"/>
+                    <a:stretch>
+                      <a:fillRect/>
+                    </a:stretch>
+                  </pic:blipFill>
+                  <pic:spPr bwMode="auto">
+                    <a:xfrm>
+                      <a:off x="0" y="0"/>
+                      <a:ext cx="5334000" cy="1747112"/>
+                    </a:xfrm>
+                    <a:prstGeom prst="rect">
+                      <a:avLst/>
+                    </a:prstGeom>
+                    <a:noFill/>
+                    <a:ln w="9525">
+                      <a:noFill/>
+                      <a:headEnd/>
+                      <a:tailEnd/>
+                    </a:ln>
+                  </pic:spPr>
+                </pic:pic>
+              </a:graphicData>
+            </a:graphic>
+          </wp:inline>
+        </w:drawing>
+      </w:r>
+    </w:p>
+    <w:p>
+      <w:pPr>
+        <w:pStyle w:val="ImageCaption"/>
+      </w:pPr>
+      <w:r>
+        <w:t xml:space="preserve">Annual load, PV, and wind profile at the baseline case (Jinan, 2023)</w:t>
+      </w:r>
+    </w:p>
+    <w:bookmarkEnd w:id="25"/>
+    <w:bookmarkStart w:id="26" w:name="weather-and-load-data"/>
     <w:p>
       <w:pPr>
         <w:pStyle w:val="Heading2"/>
@@ -723,8 +778,8 @@
         <w:t xml:space="preserve">in §16.</w:t>
       </w:r>
     </w:p>
-    <w:bookmarkEnd w:id="23"/>
-    <w:bookmarkStart w:id="24" w:name="Xecf794c691860a9bd0568d1e0fb3458cdeec4e8"/>
+    <w:bookmarkEnd w:id="26"/>
+    <w:bookmarkStart w:id="27" w:name="Xecf794c691860a9bd0568d1e0fb3458cdeec4e8"/>
     <w:p>
       <w:pPr>
         <w:pStyle w:val="Heading2"/>
@@ -952,8 +1007,8 @@
         <w:t xml:space="preserve">battery costs to compute total system LCOE.</w:t>
       </w:r>
     </w:p>
-    <w:bookmarkEnd w:id="24"/>
-    <w:bookmarkStart w:id="25" w:name="neural-network-model"/>
+    <w:bookmarkEnd w:id="27"/>
+    <w:bookmarkStart w:id="28" w:name="neural-network-model"/>
     <w:p>
       <w:pPr>
         <w:pStyle w:val="Heading2"/>
@@ -1056,8 +1111,8 @@
         <w:t xml:space="preserve">comes from its top few inputs alone versus genuinely combining all 37.</w:t>
       </w:r>
     </w:p>
-    <w:bookmarkEnd w:id="25"/>
-    <w:bookmarkStart w:id="29" w:name="scenario-dataset"/>
+    <w:bookmarkEnd w:id="28"/>
+    <w:bookmarkStart w:id="32" w:name="scenario-dataset"/>
     <w:p>
       <w:pPr>
         <w:pStyle w:val="Heading2"/>
@@ -1223,18 +1278,18 @@
           <wp:inline>
             <wp:extent cx="5334000" cy="3786417"/>
             <wp:effectExtent b="0" l="0" r="0" t="0"/>
-            <wp:docPr descr="Distribution of mechanistically optimal battery capacities across the 5,000-scenario dataset" title="" id="27" name="Picture"/>
+            <wp:docPr descr="Distribution of mechanistically optimal battery capacities across the 5,000-scenario dataset" title="" id="30" name="Picture"/>
             <a:graphic>
               <a:graphicData uri="http://schemas.openxmlformats.org/drawingml/2006/picture">
                 <pic:pic>
                   <pic:nvPicPr>
-                    <pic:cNvPr descr="../outputs/figures/20_optimal_capacity_distribution_diesel.png" id="28" name="Picture"/>
+                    <pic:cNvPr descr="../outputs/figures/20_optimal_capacity_distribution_diesel.png" id="31" name="Picture"/>
                     <pic:cNvPicPr>
                       <a:picLocks noChangeArrowheads="1" noChangeAspect="1"/>
                     </pic:cNvPicPr>
                   </pic:nvPicPr>
                   <pic:blipFill>
-                    <a:blip r:embed="rId26"/>
+                    <a:blip r:embed="rId29"/>
                     <a:stretch>
                       <a:fillRect/>
                     </a:stretch>
@@ -1269,8 +1324,8 @@
         <w:t xml:space="preserve">Distribution of mechanistically optimal battery capacities across the 5,000-scenario dataset</w:t>
       </w:r>
     </w:p>
-    <w:bookmarkEnd w:id="29"/>
-    <w:bookmarkStart w:id="42" w:name="Xe25291a883deaac517d3527bb2f260604cd68a7"/>
+    <w:bookmarkEnd w:id="32"/>
+    <w:bookmarkStart w:id="45" w:name="Xe25291a883deaac517d3527bb2f260604cd68a7"/>
     <w:p>
       <w:pPr>
         <w:pStyle w:val="Heading2"/>
@@ -1589,18 +1644,18 @@
           <wp:inline>
             <wp:extent cx="5334000" cy="3090701"/>
             <wp:effectExtent b="0" l="0" r="0" t="0"/>
-            <wp:docPr descr="Diesel engaging during a low-renewable week (Dec 25-31, 2023): renewables dip well below load, battery SOC sits near its floor for most of the week, diesel fills the remaining gap" title="" id="31" name="Picture"/>
+            <wp:docPr descr="Diesel engaging during a low-renewable week (Dec 25-31, 2023): renewables dip well below load, battery SOC sits near its floor for most of the week, diesel fills the remaining gap" title="" id="34" name="Picture"/>
             <a:graphic>
               <a:graphicData uri="http://schemas.openxmlformats.org/drawingml/2006/picture">
                 <pic:pic>
                   <pic:nvPicPr>
-                    <pic:cNvPr descr="../outputs/figures/11_diesel_engagement_week.png" id="32" name="Picture"/>
+                    <pic:cNvPr descr="../outputs/figures/11_diesel_engagement_week.png" id="35" name="Picture"/>
                     <pic:cNvPicPr>
                       <a:picLocks noChangeArrowheads="1" noChangeAspect="1"/>
                     </pic:cNvPicPr>
                   </pic:nvPicPr>
                   <pic:blipFill>
-                    <a:blip r:embed="rId30"/>
+                    <a:blip r:embed="rId33"/>
                     <a:stretch>
                       <a:fillRect/>
                     </a:stretch>
@@ -1644,18 +1699,18 @@
           <wp:inline>
             <wp:extent cx="4951216" cy="5403828"/>
             <wp:effectExtent b="0" l="0" r="0" t="0"/>
-            <wp:docPr descr="Annual energy-flow balance: renewable production (direct supply + battery charge + curtailed) and load service (direct supply + battery discharge + diesel), zero unserved" title="" id="34" name="Picture"/>
+            <wp:docPr descr="Annual energy-flow balance: renewable production (direct supply + battery charge + curtailed) and load service (direct supply + battery discharge + diesel), zero unserved" title="" id="37" name="Picture"/>
             <a:graphic>
               <a:graphicData uri="http://schemas.openxmlformats.org/drawingml/2006/picture">
                 <pic:pic>
                   <pic:nvPicPr>
-                    <pic:cNvPr descr="../outputs/figures/12_energy_flow_balance_diesel_hybrid.png" id="35" name="Picture"/>
+                    <pic:cNvPr descr="../outputs/figures/12_energy_flow_balance_diesel_hybrid.png" id="38" name="Picture"/>
                     <pic:cNvPicPr>
                       <a:picLocks noChangeArrowheads="1" noChangeAspect="1"/>
                     </pic:cNvPicPr>
                   </pic:nvPicPr>
                   <pic:blipFill>
-                    <a:blip r:embed="rId33"/>
+                    <a:blip r:embed="rId36"/>
                     <a:stretch>
                       <a:fillRect/>
                     </a:stretch>
@@ -2095,18 +2150,18 @@
           <wp:inline>
             <wp:extent cx="5334000" cy="3980798"/>
             <wp:effectExtent b="0" l="0" r="0" t="0"/>
-            <wp:docPr descr="Renewable share vs. system LCOE across the full 0-80 module candidate sweep, sweet spot marked at the minimum-LCOE point" title="" id="37" name="Picture"/>
+            <wp:docPr descr="Renewable share vs. system LCOE across the full 0-80 module candidate sweep, sweet spot marked at the minimum-LCOE point" title="" id="40" name="Picture"/>
             <a:graphic>
               <a:graphicData uri="http://schemas.openxmlformats.org/drawingml/2006/picture">
                 <pic:pic>
                   <pic:nvPicPr>
-                    <pic:cNvPr descr="../outputs/figures/13_renewable_share_vs_lcoe.png" id="38" name="Picture"/>
+                    <pic:cNvPr descr="../outputs/figures/13_renewable_share_vs_lcoe.png" id="41" name="Picture"/>
                     <pic:cNvPicPr>
                       <a:picLocks noChangeArrowheads="1" noChangeAspect="1"/>
                     </pic:cNvPicPr>
                   </pic:nvPicPr>
                   <pic:blipFill>
-                    <a:blip r:embed="rId36"/>
+                    <a:blip r:embed="rId39"/>
                     <a:stretch>
                       <a:fillRect/>
                     </a:stretch>
@@ -2150,18 +2205,18 @@
           <wp:inline>
             <wp:extent cx="5334000" cy="3303929"/>
             <wp:effectExtent b="0" l="0" r="0" t="0"/>
-            <wp:docPr descr="Battery capacity vs. system LCOE, same sweep: a clean U-shape with the minimum at 6,000 kWh" title="" id="40" name="Picture"/>
+            <wp:docPr descr="Battery capacity vs. system LCOE, same sweep: a clean U-shape with the minimum at 6,000 kWh" title="" id="43" name="Picture"/>
             <a:graphic>
               <a:graphicData uri="http://schemas.openxmlformats.org/drawingml/2006/picture">
                 <pic:pic>
                   <pic:nvPicPr>
-                    <pic:cNvPr descr="../outputs/figures/14_battery_capacity_vs_lcoe.png" id="41" name="Picture"/>
+                    <pic:cNvPr descr="../outputs/figures/14_battery_capacity_vs_lcoe.png" id="44" name="Picture"/>
                     <pic:cNvPicPr>
                       <a:picLocks noChangeArrowheads="1" noChangeAspect="1"/>
                     </pic:cNvPicPr>
                   </pic:nvPicPr>
                   <pic:blipFill>
-                    <a:blip r:embed="rId39"/>
+                    <a:blip r:embed="rId42"/>
                     <a:stretch>
                       <a:fillRect/>
                     </a:stretch>
@@ -2310,8 +2365,8 @@
         <w:t xml:space="preserve">scenario, across the full sampled dataset.</w:t>
       </w:r>
     </w:p>
-    <w:bookmarkEnd w:id="42"/>
-    <w:bookmarkStart w:id="52" w:name="results-accuracy-and-cross-validation"/>
+    <w:bookmarkEnd w:id="45"/>
+    <w:bookmarkStart w:id="55" w:name="results-accuracy-and-cross-validation"/>
     <w:p>
       <w:pPr>
         <w:pStyle w:val="Heading2"/>
@@ -2561,18 +2616,18 @@
           <wp:inline>
             <wp:extent cx="5334000" cy="3303929"/>
             <wp:effectExtent b="0" l="0" r="0" t="0"/>
-            <wp:docPr descr="Neural network training/validation loss curves" title="" id="44" name="Picture"/>
+            <wp:docPr descr="Neural network training/validation loss curves" title="" id="47" name="Picture"/>
             <a:graphic>
               <a:graphicData uri="http://schemas.openxmlformats.org/drawingml/2006/picture">
                 <pic:pic>
                   <pic:nvPicPr>
-                    <pic:cNvPr descr="../outputs/figures/21_training_history_diesel.png" id="45" name="Picture"/>
+                    <pic:cNvPr descr="../outputs/figures/21_training_history_diesel.png" id="48" name="Picture"/>
                     <pic:cNvPicPr>
                       <a:picLocks noChangeArrowheads="1" noChangeAspect="1"/>
                     </pic:cNvPicPr>
                   </pic:nvPicPr>
                   <pic:blipFill>
-                    <a:blip r:embed="rId43"/>
+                    <a:blip r:embed="rId46"/>
                     <a:stretch>
                       <a:fillRect/>
                     </a:stretch>
@@ -2616,18 +2671,18 @@
           <wp:inline>
             <wp:extent cx="5334000" cy="5330984"/>
             <wp:effectExtent b="0" l="0" r="0" t="0"/>
-            <wp:docPr descr="Predicted vs. reference capacity, 1:1 line, R² annotated, 751-scenario test split" title="" id="47" name="Picture"/>
+            <wp:docPr descr="Predicted vs. reference capacity, 1:1 line, R² annotated, 751-scenario test split" title="" id="50" name="Picture"/>
             <a:graphic>
               <a:graphicData uri="http://schemas.openxmlformats.org/drawingml/2006/picture">
                 <pic:pic>
                   <pic:nvPicPr>
-                    <pic:cNvPr descr="../outputs/figures/22_predicted_vs_reference_diesel.png" id="48" name="Picture"/>
+                    <pic:cNvPr descr="../outputs/figures/22_predicted_vs_reference_diesel.png" id="51" name="Picture"/>
                     <pic:cNvPicPr>
                       <a:picLocks noChangeArrowheads="1" noChangeAspect="1"/>
                     </pic:cNvPicPr>
                   </pic:nvPicPr>
                   <pic:blipFill>
-                    <a:blip r:embed="rId46"/>
+                    <a:blip r:embed="rId49"/>
                     <a:stretch>
                       <a:fillRect/>
                     </a:stretch>
@@ -2926,18 +2981,18 @@
           <wp:inline>
             <wp:extent cx="5334000" cy="1943344"/>
             <wp:effectExtent b="0" l="0" r="0" t="0"/>
-            <wp:docPr descr="Cross-validation error bars: MAE, RMSE, and R² (mean ± std, 10 independent splits)" title="" id="50" name="Picture"/>
+            <wp:docPr descr="Cross-validation error bars: MAE, RMSE, and R² (mean ± std, 10 independent splits)" title="" id="53" name="Picture"/>
             <a:graphic>
               <a:graphicData uri="http://schemas.openxmlformats.org/drawingml/2006/picture">
                 <pic:pic>
                   <pic:nvPicPr>
-                    <pic:cNvPr descr="../outputs/figures/23_cross_validation_diesel.png" id="51" name="Picture"/>
+                    <pic:cNvPr descr="../outputs/figures/23_cross_validation_diesel.png" id="54" name="Picture"/>
                     <pic:cNvPicPr>
                       <a:picLocks noChangeArrowheads="1" noChangeAspect="1"/>
                     </pic:cNvPicPr>
                   </pic:nvPicPr>
                   <pic:blipFill>
-                    <a:blip r:embed="rId49"/>
+                    <a:blip r:embed="rId52"/>
                     <a:stretch>
                       <a:fillRect/>
                     </a:stretch>
@@ -3010,8 +3065,8 @@
         <w:t xml:space="preserve">rather than one driven by a fixed constraint.</w:t>
       </w:r>
     </w:p>
-    <w:bookmarkEnd w:id="52"/>
-    <w:bookmarkStart w:id="56" w:name="results-learning-curve"/>
+    <w:bookmarkEnd w:id="55"/>
+    <w:bookmarkStart w:id="59" w:name="results-learning-curve"/>
     <w:p>
       <w:pPr>
         <w:pStyle w:val="Heading2"/>
@@ -3325,18 +3380,18 @@
           <wp:inline>
             <wp:extent cx="5334000" cy="3303929"/>
             <wp:effectExtent b="0" l="0" r="0" t="0"/>
-            <wp:docPr descr="Learning curve: MAE and R² vs. training-set size" title="" id="54" name="Picture"/>
+            <wp:docPr descr="Learning curve: MAE and R² vs. training-set size" title="" id="57" name="Picture"/>
             <a:graphic>
               <a:graphicData uri="http://schemas.openxmlformats.org/drawingml/2006/picture">
                 <pic:pic>
                   <pic:nvPicPr>
-                    <pic:cNvPr descr="../outputs/figures/24_learning_curve_diesel.png" id="55" name="Picture"/>
+                    <pic:cNvPr descr="../outputs/figures/24_learning_curve_diesel.png" id="58" name="Picture"/>
                     <pic:cNvPicPr>
                       <a:picLocks noChangeArrowheads="1" noChangeAspect="1"/>
                     </pic:cNvPicPr>
                   </pic:nvPicPr>
                   <pic:blipFill>
-                    <a:blip r:embed="rId53"/>
+                    <a:blip r:embed="rId56"/>
                     <a:stretch>
                       <a:fillRect/>
                     </a:stretch>
@@ -3421,8 +3476,8 @@
         <w:t xml:space="preserve">left for additional training data to capture.</w:t>
       </w:r>
     </w:p>
-    <w:bookmarkEnd w:id="56"/>
-    <w:bookmarkStart w:id="60" w:name="results-permutation-feature-importance"/>
+    <w:bookmarkEnd w:id="59"/>
+    <w:bookmarkStart w:id="63" w:name="results-permutation-feature-importance"/>
     <w:p>
       <w:pPr>
         <w:pStyle w:val="Heading2"/>
@@ -3725,18 +3780,18 @@
           <wp:inline>
             <wp:extent cx="5334000" cy="5004573"/>
             <wp:effectExtent b="0" l="0" r="0" t="0"/>
-            <wp:docPr descr="Permutation feature importance, top 15 features by mean MAE increase" title="" id="58" name="Picture"/>
+            <wp:docPr descr="Permutation feature importance, top 15 features by mean MAE increase" title="" id="61" name="Picture"/>
             <a:graphic>
               <a:graphicData uri="http://schemas.openxmlformats.org/drawingml/2006/picture">
                 <pic:pic>
                   <pic:nvPicPr>
-                    <pic:cNvPr descr="../outputs/figures/25_permutation_importance_diesel.png" id="59" name="Picture"/>
+                    <pic:cNvPr descr="../outputs/figures/25_permutation_importance_diesel.png" id="62" name="Picture"/>
                     <pic:cNvPicPr>
                       <a:picLocks noChangeArrowheads="1" noChangeAspect="1"/>
                     </pic:cNvPicPr>
                   </pic:nvPicPr>
                   <pic:blipFill>
-                    <a:blip r:embed="rId57"/>
+                    <a:blip r:embed="rId60"/>
                     <a:stretch>
                       <a:fillRect/>
                     </a:stretch>
@@ -3843,8 +3898,8 @@
         <w:t xml:space="preserve">deficits, not a pass/fail threshold, drives the ranking.</w:t>
       </w:r>
     </w:p>
-    <w:bookmarkEnd w:id="60"/>
-    <w:bookmarkStart w:id="61" w:name="results-simple-baseline-comparison"/>
+    <w:bookmarkEnd w:id="63"/>
+    <w:bookmarkStart w:id="64" w:name="results-simple-baseline-comparison"/>
     <w:p>
       <w:pPr>
         <w:pStyle w:val="Heading2"/>
@@ -4135,8 +4190,8 @@
         <w:t xml:space="preserve">inputs.</w:t>
       </w:r>
     </w:p>
-    <w:bookmarkEnd w:id="61"/>
-    <w:bookmarkStart w:id="65" w:name="Xbb45e3d72d9f06bc05a60bf2cd70c97a42b3785"/>
+    <w:bookmarkEnd w:id="64"/>
+    <w:bookmarkStart w:id="68" w:name="Xbb45e3d72d9f06bc05a60bf2cd70c97a42b3785"/>
     <w:p>
       <w:pPr>
         <w:pStyle w:val="Heading2"/>
@@ -4702,18 +4757,18 @@
           <wp:inline>
             <wp:extent cx="5334000" cy="5026925"/>
             <wp:effectExtent b="0" l="0" r="0" t="0"/>
-            <wp:docPr descr="How much the AI’s choice leans on diesel vs. the true optimum, per test-split scenario" title="" id="63" name="Picture"/>
+            <wp:docPr descr="How much the AI’s choice leans on diesel vs. the true optimum, per test-split scenario" title="" id="66" name="Picture"/>
             <a:graphic>
               <a:graphicData uri="http://schemas.openxmlformats.org/drawingml/2006/picture">
                 <pic:pic>
                   <pic:nvPicPr>
-                    <pic:cNvPr descr="../outputs/figures/26_lean_on_diesel_diagnostic.png" id="64" name="Picture"/>
+                    <pic:cNvPr descr="../outputs/figures/26_lean_on_diesel_diagnostic.png" id="67" name="Picture"/>
                     <pic:cNvPicPr>
                       <a:picLocks noChangeArrowheads="1" noChangeAspect="1"/>
                     </pic:cNvPicPr>
                   </pic:nvPicPr>
                   <pic:blipFill>
-                    <a:blip r:embed="rId62"/>
+                    <a:blip r:embed="rId65"/>
                     <a:stretch>
                       <a:fillRect/>
                     </a:stretch>
@@ -4814,8 +4869,8 @@
         <w:t xml:space="preserve">by a modest amount, not a large one.</w:t>
       </w:r>
     </w:p>
-    <w:bookmarkEnd w:id="65"/>
-    <w:bookmarkStart w:id="69" w:name="results-cost-sensitivity"/>
+    <w:bookmarkEnd w:id="68"/>
+    <w:bookmarkStart w:id="72" w:name="results-cost-sensitivity"/>
     <w:p>
       <w:pPr>
         <w:pStyle w:val="Heading2"/>
@@ -5128,18 +5183,18 @@
           <wp:inline>
             <wp:extent cx="5334000" cy="3784587"/>
             <wp:effectExtent b="0" l="0" r="0" t="0"/>
-            <wp:docPr descr="Optimal battery size shifts with battery cost — monotonic across all three price points" title="" id="67" name="Picture"/>
+            <wp:docPr descr="Optimal battery size shifts with battery cost — monotonic across all three price points" title="" id="70" name="Picture"/>
             <a:graphic>
               <a:graphicData uri="http://schemas.openxmlformats.org/drawingml/2006/picture">
                 <pic:pic>
                   <pic:nvPicPr>
-                    <pic:cNvPr descr="../outputs/figures/27_optimal_modules_by_cost.png" id="68" name="Picture"/>
+                    <pic:cNvPr descr="../outputs/figures/27_optimal_modules_by_cost.png" id="71" name="Picture"/>
                     <pic:cNvPicPr>
                       <a:picLocks noChangeArrowheads="1" noChangeAspect="1"/>
                     </pic:cNvPicPr>
                   </pic:nvPicPr>
                   <pic:blipFill>
-                    <a:blip r:embed="rId66"/>
+                    <a:blip r:embed="rId69"/>
                     <a:stretch>
                       <a:fillRect/>
                     </a:stretch>
@@ -5224,8 +5279,8 @@
         <w:t xml:space="preserve">battery cost assumption changed materially.</w:t>
       </w:r>
     </w:p>
-    <w:bookmarkEnd w:id="69"/>
-    <w:bookmarkStart w:id="70" w:name="computational-efficiency"/>
+    <w:bookmarkEnd w:id="72"/>
+    <w:bookmarkStart w:id="73" w:name="computational-efficiency"/>
     <w:p>
       <w:pPr>
         <w:pStyle w:val="Heading2"/>
@@ -5522,8 +5577,8 @@
         <w:t xml:space="preserve">evaluating.</w:t>
       </w:r>
     </w:p>
-    <w:bookmarkEnd w:id="70"/>
-    <w:bookmarkStart w:id="71" w:name="discussion-and-limitations"/>
+    <w:bookmarkEnd w:id="73"/>
+    <w:bookmarkStart w:id="74" w:name="discussion-and-limitations"/>
     <w:p>
       <w:pPr>
         <w:pStyle w:val="Heading2"/>
@@ -5782,8 +5837,8 @@
         <w:t xml:space="preserve">over.</w:t>
       </w:r>
     </w:p>
-    <w:bookmarkEnd w:id="71"/>
-    <w:bookmarkStart w:id="72" w:name="conclusion"/>
+    <w:bookmarkEnd w:id="74"/>
+    <w:bookmarkStart w:id="75" w:name="conclusion"/>
     <w:p>
       <w:pPr>
         <w:pStyle w:val="Heading2"/>
@@ -5920,8 +5975,8 @@
         <w:t xml:space="preserve">target is conditioned on the battery cost assumption it was trained under.</w:t>
       </w:r>
     </w:p>
-    <w:bookmarkEnd w:id="72"/>
-    <w:bookmarkEnd w:id="73"/>
+    <w:bookmarkEnd w:id="75"/>
+    <w:bookmarkEnd w:id="76"/>
     <w:sectPr/>
   </w:body>
 </w:document>

</xml_diff>

<commit_message>
Add the wind-speed distribution / turbine power curve figure to the current report
plot_wind_speed_distribution_and_power_curve() existed in plotting.py
(inherited from V1) but was never actually invoked anywhere in V2, so no
current figure existed from it -- the version the user had seen was V1's,
generated under the old residential-turbine config. Generated it fresh
against the current diesel-hybrid baseline's actual wind config (1,450 kW
turbine, 60 m hub height) via diesel_hybrid_demo.py, which already loads
the weather/wind config this figure needs, and added it to the technical
report's wind-model subsection (SS5) with a short reading of what it shows
(hub-height wind speed sits mostly below the turbine's rated speed).
Re-exported to PDF/Word; full test suite (178 tests) still green.
</commit_message>
<xml_diff>
--- a/v2/reports/exports/technical_report.docx
+++ b/v2/reports/exports/technical_report.docx
@@ -36,7 +36,7 @@
         </w:p>
       </w:sdtContent>
     </w:sdt>
-    <w:bookmarkStart w:id="79" w:name="X320dbef72c152cb8a69731335d4bee1c5c3117e"/>
+    <w:bookmarkStart w:id="82" w:name="X320dbef72c152cb8a69731335d4bee1c5c3117e"/>
     <w:p>
       <w:pPr>
         <w:pStyle w:val="Heading1"/>
@@ -779,7 +779,7 @@
       </w:r>
     </w:p>
     <w:bookmarkEnd w:id="26"/>
-    <w:bookmarkStart w:id="27" w:name="Xecf794c691860a9bd0568d1e0fb3458cdeec4e8"/>
+    <w:bookmarkStart w:id="30" w:name="Xecf794c691860a9bd0568d1e0fb3458cdeec4e8"/>
     <w:p>
       <w:pPr>
         <w:pStyle w:val="Heading2"/>
@@ -909,6 +909,93 @@
     </w:p>
     <w:p>
       <w:pPr>
+        <w:pStyle w:val="CaptionedFigure"/>
+      </w:pPr>
+      <w:r>
+        <w:drawing>
+          <wp:inline>
+            <wp:extent cx="5334000" cy="1969247"/>
+            <wp:effectExtent b="0" l="0" r="0" t="0"/>
+            <wp:docPr descr="Hub-height wind-speed distribution at the baseline site and the modelled 1,450 kW turbine’s power curve" title="" id="28" name="Picture"/>
+            <a:graphic>
+              <a:graphicData uri="http://schemas.openxmlformats.org/drawingml/2006/picture">
+                <pic:pic>
+                  <pic:nvPicPr>
+                    <pic:cNvPr descr="../outputs/figures/06_wind_speed_power_curve.png" id="29" name="Picture"/>
+                    <pic:cNvPicPr>
+                      <a:picLocks noChangeArrowheads="1" noChangeAspect="1"/>
+                    </pic:cNvPicPr>
+                  </pic:nvPicPr>
+                  <pic:blipFill>
+                    <a:blip r:embed="rId27"/>
+                    <a:stretch>
+                      <a:fillRect/>
+                    </a:stretch>
+                  </pic:blipFill>
+                  <pic:spPr bwMode="auto">
+                    <a:xfrm>
+                      <a:off x="0" y="0"/>
+                      <a:ext cx="5334000" cy="1969247"/>
+                    </a:xfrm>
+                    <a:prstGeom prst="rect">
+                      <a:avLst/>
+                    </a:prstGeom>
+                    <a:noFill/>
+                    <a:ln w="9525">
+                      <a:noFill/>
+                      <a:headEnd/>
+                      <a:tailEnd/>
+                    </a:ln>
+                  </pic:spPr>
+                </pic:pic>
+              </a:graphicData>
+            </a:graphic>
+          </wp:inline>
+        </w:drawing>
+      </w:r>
+    </w:p>
+    <w:p>
+      <w:pPr>
+        <w:pStyle w:val="ImageCaption"/>
+      </w:pPr>
+      <w:r>
+        <w:t xml:space="preserve">Hub-height wind-speed distribution at the baseline site and the modelled 1,450 kW turbine’s power curve</w:t>
+      </w:r>
+    </w:p>
+    <w:p>
+      <w:pPr>
+        <w:pStyle w:val="BodyText"/>
+      </w:pPr>
+      <w:r>
+        <w:t xml:space="preserve">The site’s hub-height wind speed is concentrated well below the turbine’s</w:t>
+      </w:r>
+      <w:r>
+        <w:t xml:space="preserve"> </w:t>
+      </w:r>
+      <w:r>
+        <w:t xml:space="preserve">11 m/s rated speed (median ≈4 m/s), so the turbine spends most operating</w:t>
+      </w:r>
+      <w:r>
+        <w:t xml:space="preserve"> </w:t>
+      </w:r>
+      <w:r>
+        <w:t xml:space="preserve">hours on the steep, sub-rated part of the curve rather than at its 1,450 kW</w:t>
+      </w:r>
+      <w:r>
+        <w:t xml:space="preserve"> </w:t>
+      </w:r>
+      <w:r>
+        <w:t xml:space="preserve">plateau — wind generation at this site is real but modest relative to</w:t>
+      </w:r>
+      <w:r>
+        <w:t xml:space="preserve"> </w:t>
+      </w:r>
+      <w:r>
+        <w:t xml:space="preserve">nameplate capacity, with PV supplying the larger share of the renewable mix.</w:t>
+      </w:r>
+    </w:p>
+    <w:p>
+      <w:pPr>
         <w:pStyle w:val="BodyText"/>
       </w:pPr>
       <w:r>
@@ -1007,8 +1094,8 @@
         <w:t xml:space="preserve">battery costs to compute total system LCOE.</w:t>
       </w:r>
     </w:p>
-    <w:bookmarkEnd w:id="27"/>
-    <w:bookmarkStart w:id="28" w:name="neural-network-model"/>
+    <w:bookmarkEnd w:id="30"/>
+    <w:bookmarkStart w:id="31" w:name="neural-network-model"/>
     <w:p>
       <w:pPr>
         <w:pStyle w:val="Heading2"/>
@@ -1111,8 +1198,8 @@
         <w:t xml:space="preserve">comes from its top few inputs alone versus genuinely combining all 37.</w:t>
       </w:r>
     </w:p>
-    <w:bookmarkEnd w:id="28"/>
-    <w:bookmarkStart w:id="32" w:name="scenario-dataset"/>
+    <w:bookmarkEnd w:id="31"/>
+    <w:bookmarkStart w:id="35" w:name="scenario-dataset"/>
     <w:p>
       <w:pPr>
         <w:pStyle w:val="Heading2"/>
@@ -1278,18 +1365,18 @@
           <wp:inline>
             <wp:extent cx="5334000" cy="3786417"/>
             <wp:effectExtent b="0" l="0" r="0" t="0"/>
-            <wp:docPr descr="Distribution of mechanistically optimal battery capacities across the 5,000-scenario dataset" title="" id="30" name="Picture"/>
+            <wp:docPr descr="Distribution of mechanistically optimal battery capacities across the 5,000-scenario dataset" title="" id="33" name="Picture"/>
             <a:graphic>
               <a:graphicData uri="http://schemas.openxmlformats.org/drawingml/2006/picture">
                 <pic:pic>
                   <pic:nvPicPr>
-                    <pic:cNvPr descr="../outputs/figures/20_optimal_capacity_distribution_diesel.png" id="31" name="Picture"/>
+                    <pic:cNvPr descr="../outputs/figures/20_optimal_capacity_distribution_diesel.png" id="34" name="Picture"/>
                     <pic:cNvPicPr>
                       <a:picLocks noChangeArrowheads="1" noChangeAspect="1"/>
                     </pic:cNvPicPr>
                   </pic:nvPicPr>
                   <pic:blipFill>
-                    <a:blip r:embed="rId29"/>
+                    <a:blip r:embed="rId32"/>
                     <a:stretch>
                       <a:fillRect/>
                     </a:stretch>
@@ -1324,8 +1411,8 @@
         <w:t xml:space="preserve">Distribution of mechanistically optimal battery capacities across the 5,000-scenario dataset</w:t>
       </w:r>
     </w:p>
-    <w:bookmarkEnd w:id="32"/>
-    <w:bookmarkStart w:id="45" w:name="Xe25291a883deaac517d3527bb2f260604cd68a7"/>
+    <w:bookmarkEnd w:id="35"/>
+    <w:bookmarkStart w:id="48" w:name="Xe25291a883deaac517d3527bb2f260604cd68a7"/>
     <w:p>
       <w:pPr>
         <w:pStyle w:val="Heading2"/>
@@ -1644,18 +1731,18 @@
           <wp:inline>
             <wp:extent cx="5334000" cy="3090701"/>
             <wp:effectExtent b="0" l="0" r="0" t="0"/>
-            <wp:docPr descr="Diesel engaging during a low-renewable week (Dec 25-31, 2023): renewables dip well below load, battery SOC sits near its floor for most of the week, diesel fills the remaining gap" title="" id="34" name="Picture"/>
+            <wp:docPr descr="Diesel engaging during a low-renewable week (Dec 25-31, 2023): renewables dip well below load, battery SOC sits near its floor for most of the week, diesel fills the remaining gap" title="" id="37" name="Picture"/>
             <a:graphic>
               <a:graphicData uri="http://schemas.openxmlformats.org/drawingml/2006/picture">
                 <pic:pic>
                   <pic:nvPicPr>
-                    <pic:cNvPr descr="../outputs/figures/11_diesel_engagement_week.png" id="35" name="Picture"/>
+                    <pic:cNvPr descr="../outputs/figures/11_diesel_engagement_week.png" id="38" name="Picture"/>
                     <pic:cNvPicPr>
                       <a:picLocks noChangeArrowheads="1" noChangeAspect="1"/>
                     </pic:cNvPicPr>
                   </pic:nvPicPr>
                   <pic:blipFill>
-                    <a:blip r:embed="rId33"/>
+                    <a:blip r:embed="rId36"/>
                     <a:stretch>
                       <a:fillRect/>
                     </a:stretch>
@@ -1699,18 +1786,18 @@
           <wp:inline>
             <wp:extent cx="4951216" cy="5403828"/>
             <wp:effectExtent b="0" l="0" r="0" t="0"/>
-            <wp:docPr descr="Annual energy-flow balance: renewable production (direct supply + battery charge + curtailed) and load service (direct supply + battery discharge + diesel), zero unserved" title="" id="37" name="Picture"/>
+            <wp:docPr descr="Annual energy-flow balance: renewable production (direct supply + battery charge + curtailed) and load service (direct supply + battery discharge + diesel), zero unserved" title="" id="40" name="Picture"/>
             <a:graphic>
               <a:graphicData uri="http://schemas.openxmlformats.org/drawingml/2006/picture">
                 <pic:pic>
                   <pic:nvPicPr>
-                    <pic:cNvPr descr="../outputs/figures/12_energy_flow_balance_diesel_hybrid.png" id="38" name="Picture"/>
+                    <pic:cNvPr descr="../outputs/figures/12_energy_flow_balance_diesel_hybrid.png" id="41" name="Picture"/>
                     <pic:cNvPicPr>
                       <a:picLocks noChangeArrowheads="1" noChangeAspect="1"/>
                     </pic:cNvPicPr>
                   </pic:nvPicPr>
                   <pic:blipFill>
-                    <a:blip r:embed="rId36"/>
+                    <a:blip r:embed="rId39"/>
                     <a:stretch>
                       <a:fillRect/>
                     </a:stretch>
@@ -2150,18 +2237,18 @@
           <wp:inline>
             <wp:extent cx="5334000" cy="3980798"/>
             <wp:effectExtent b="0" l="0" r="0" t="0"/>
-            <wp:docPr descr="Renewable share vs. system LCOE across the full 0-80 module candidate sweep, sweet spot marked at the minimum-LCOE point" title="" id="40" name="Picture"/>
+            <wp:docPr descr="Renewable share vs. system LCOE across the full 0-80 module candidate sweep, sweet spot marked at the minimum-LCOE point" title="" id="43" name="Picture"/>
             <a:graphic>
               <a:graphicData uri="http://schemas.openxmlformats.org/drawingml/2006/picture">
                 <pic:pic>
                   <pic:nvPicPr>
-                    <pic:cNvPr descr="../outputs/figures/13_renewable_share_vs_lcoe.png" id="41" name="Picture"/>
+                    <pic:cNvPr descr="../outputs/figures/13_renewable_share_vs_lcoe.png" id="44" name="Picture"/>
                     <pic:cNvPicPr>
                       <a:picLocks noChangeArrowheads="1" noChangeAspect="1"/>
                     </pic:cNvPicPr>
                   </pic:nvPicPr>
                   <pic:blipFill>
-                    <a:blip r:embed="rId39"/>
+                    <a:blip r:embed="rId42"/>
                     <a:stretch>
                       <a:fillRect/>
                     </a:stretch>
@@ -2205,18 +2292,18 @@
           <wp:inline>
             <wp:extent cx="5334000" cy="3303929"/>
             <wp:effectExtent b="0" l="0" r="0" t="0"/>
-            <wp:docPr descr="Battery capacity vs. system LCOE, same sweep: a clean U-shape with the minimum at 6,000 kWh" title="" id="43" name="Picture"/>
+            <wp:docPr descr="Battery capacity vs. system LCOE, same sweep: a clean U-shape with the minimum at 6,000 kWh" title="" id="46" name="Picture"/>
             <a:graphic>
               <a:graphicData uri="http://schemas.openxmlformats.org/drawingml/2006/picture">
                 <pic:pic>
                   <pic:nvPicPr>
-                    <pic:cNvPr descr="../outputs/figures/14_battery_capacity_vs_lcoe.png" id="44" name="Picture"/>
+                    <pic:cNvPr descr="../outputs/figures/14_battery_capacity_vs_lcoe.png" id="47" name="Picture"/>
                     <pic:cNvPicPr>
                       <a:picLocks noChangeArrowheads="1" noChangeAspect="1"/>
                     </pic:cNvPicPr>
                   </pic:nvPicPr>
                   <pic:blipFill>
-                    <a:blip r:embed="rId42"/>
+                    <a:blip r:embed="rId45"/>
                     <a:stretch>
                       <a:fillRect/>
                     </a:stretch>
@@ -2365,8 +2452,8 @@
         <w:t xml:space="preserve">scenario, across the full sampled dataset.</w:t>
       </w:r>
     </w:p>
-    <w:bookmarkEnd w:id="45"/>
-    <w:bookmarkStart w:id="55" w:name="results-accuracy-and-cross-validation"/>
+    <w:bookmarkEnd w:id="48"/>
+    <w:bookmarkStart w:id="58" w:name="results-accuracy-and-cross-validation"/>
     <w:p>
       <w:pPr>
         <w:pStyle w:val="Heading2"/>
@@ -2616,18 +2703,18 @@
           <wp:inline>
             <wp:extent cx="5334000" cy="3303929"/>
             <wp:effectExtent b="0" l="0" r="0" t="0"/>
-            <wp:docPr descr="Neural network training/validation loss curves" title="" id="47" name="Picture"/>
+            <wp:docPr descr="Neural network training/validation loss curves" title="" id="50" name="Picture"/>
             <a:graphic>
               <a:graphicData uri="http://schemas.openxmlformats.org/drawingml/2006/picture">
                 <pic:pic>
                   <pic:nvPicPr>
-                    <pic:cNvPr descr="../outputs/figures/21_training_history_diesel.png" id="48" name="Picture"/>
+                    <pic:cNvPr descr="../outputs/figures/21_training_history_diesel.png" id="51" name="Picture"/>
                     <pic:cNvPicPr>
                       <a:picLocks noChangeArrowheads="1" noChangeAspect="1"/>
                     </pic:cNvPicPr>
                   </pic:nvPicPr>
                   <pic:blipFill>
-                    <a:blip r:embed="rId46"/>
+                    <a:blip r:embed="rId49"/>
                     <a:stretch>
                       <a:fillRect/>
                     </a:stretch>
@@ -2671,18 +2758,18 @@
           <wp:inline>
             <wp:extent cx="5334000" cy="5330984"/>
             <wp:effectExtent b="0" l="0" r="0" t="0"/>
-            <wp:docPr descr="Predicted vs. reference capacity, 1:1 line, R² annotated, 751-scenario test split" title="" id="50" name="Picture"/>
+            <wp:docPr descr="Predicted vs. reference capacity, 1:1 line, R² annotated, 751-scenario test split" title="" id="53" name="Picture"/>
             <a:graphic>
               <a:graphicData uri="http://schemas.openxmlformats.org/drawingml/2006/picture">
                 <pic:pic>
                   <pic:nvPicPr>
-                    <pic:cNvPr descr="../outputs/figures/22_predicted_vs_reference_diesel.png" id="51" name="Picture"/>
+                    <pic:cNvPr descr="../outputs/figures/22_predicted_vs_reference_diesel.png" id="54" name="Picture"/>
                     <pic:cNvPicPr>
                       <a:picLocks noChangeArrowheads="1" noChangeAspect="1"/>
                     </pic:cNvPicPr>
                   </pic:nvPicPr>
                   <pic:blipFill>
-                    <a:blip r:embed="rId49"/>
+                    <a:blip r:embed="rId52"/>
                     <a:stretch>
                       <a:fillRect/>
                     </a:stretch>
@@ -2981,18 +3068,18 @@
           <wp:inline>
             <wp:extent cx="5334000" cy="1943344"/>
             <wp:effectExtent b="0" l="0" r="0" t="0"/>
-            <wp:docPr descr="Cross-validation error bars: MAE, RMSE, and R² (mean ± std, 10 independent splits)" title="" id="53" name="Picture"/>
+            <wp:docPr descr="Cross-validation error bars: MAE, RMSE, and R² (mean ± std, 10 independent splits)" title="" id="56" name="Picture"/>
             <a:graphic>
               <a:graphicData uri="http://schemas.openxmlformats.org/drawingml/2006/picture">
                 <pic:pic>
                   <pic:nvPicPr>
-                    <pic:cNvPr descr="../outputs/figures/23_cross_validation_diesel.png" id="54" name="Picture"/>
+                    <pic:cNvPr descr="../outputs/figures/23_cross_validation_diesel.png" id="57" name="Picture"/>
                     <pic:cNvPicPr>
                       <a:picLocks noChangeArrowheads="1" noChangeAspect="1"/>
                     </pic:cNvPicPr>
                   </pic:nvPicPr>
                   <pic:blipFill>
-                    <a:blip r:embed="rId52"/>
+                    <a:blip r:embed="rId55"/>
                     <a:stretch>
                       <a:fillRect/>
                     </a:stretch>
@@ -3065,8 +3152,8 @@
         <w:t xml:space="preserve">rather than one driven by a fixed constraint.</w:t>
       </w:r>
     </w:p>
-    <w:bookmarkEnd w:id="55"/>
-    <w:bookmarkStart w:id="59" w:name="results-learning-curve"/>
+    <w:bookmarkEnd w:id="58"/>
+    <w:bookmarkStart w:id="62" w:name="results-learning-curve"/>
     <w:p>
       <w:pPr>
         <w:pStyle w:val="Heading2"/>
@@ -3380,18 +3467,18 @@
           <wp:inline>
             <wp:extent cx="5334000" cy="3303929"/>
             <wp:effectExtent b="0" l="0" r="0" t="0"/>
-            <wp:docPr descr="Learning curve: MAE and R² vs. training-set size" title="" id="57" name="Picture"/>
+            <wp:docPr descr="Learning curve: MAE and R² vs. training-set size" title="" id="60" name="Picture"/>
             <a:graphic>
               <a:graphicData uri="http://schemas.openxmlformats.org/drawingml/2006/picture">
                 <pic:pic>
                   <pic:nvPicPr>
-                    <pic:cNvPr descr="../outputs/figures/24_learning_curve_diesel.png" id="58" name="Picture"/>
+                    <pic:cNvPr descr="../outputs/figures/24_learning_curve_diesel.png" id="61" name="Picture"/>
                     <pic:cNvPicPr>
                       <a:picLocks noChangeArrowheads="1" noChangeAspect="1"/>
                     </pic:cNvPicPr>
                   </pic:nvPicPr>
                   <pic:blipFill>
-                    <a:blip r:embed="rId56"/>
+                    <a:blip r:embed="rId59"/>
                     <a:stretch>
                       <a:fillRect/>
                     </a:stretch>
@@ -3476,8 +3563,8 @@
         <w:t xml:space="preserve">left for additional training data to capture.</w:t>
       </w:r>
     </w:p>
-    <w:bookmarkEnd w:id="59"/>
-    <w:bookmarkStart w:id="63" w:name="results-permutation-feature-importance"/>
+    <w:bookmarkEnd w:id="62"/>
+    <w:bookmarkStart w:id="66" w:name="results-permutation-feature-importance"/>
     <w:p>
       <w:pPr>
         <w:pStyle w:val="Heading2"/>
@@ -3780,18 +3867,18 @@
           <wp:inline>
             <wp:extent cx="5334000" cy="5004573"/>
             <wp:effectExtent b="0" l="0" r="0" t="0"/>
-            <wp:docPr descr="Permutation feature importance, top 15 features by mean MAE increase" title="" id="61" name="Picture"/>
+            <wp:docPr descr="Permutation feature importance, top 15 features by mean MAE increase" title="" id="64" name="Picture"/>
             <a:graphic>
               <a:graphicData uri="http://schemas.openxmlformats.org/drawingml/2006/picture">
                 <pic:pic>
                   <pic:nvPicPr>
-                    <pic:cNvPr descr="../outputs/figures/25_permutation_importance_diesel.png" id="62" name="Picture"/>
+                    <pic:cNvPr descr="../outputs/figures/25_permutation_importance_diesel.png" id="65" name="Picture"/>
                     <pic:cNvPicPr>
                       <a:picLocks noChangeArrowheads="1" noChangeAspect="1"/>
                     </pic:cNvPicPr>
                   </pic:nvPicPr>
                   <pic:blipFill>
-                    <a:blip r:embed="rId60"/>
+                    <a:blip r:embed="rId63"/>
                     <a:stretch>
                       <a:fillRect/>
                     </a:stretch>
@@ -3898,8 +3985,8 @@
         <w:t xml:space="preserve">deficits, not a pass/fail threshold, drives the ranking.</w:t>
       </w:r>
     </w:p>
-    <w:bookmarkEnd w:id="63"/>
-    <w:bookmarkStart w:id="64" w:name="results-simple-baseline-comparison"/>
+    <w:bookmarkEnd w:id="66"/>
+    <w:bookmarkStart w:id="67" w:name="results-simple-baseline-comparison"/>
     <w:p>
       <w:pPr>
         <w:pStyle w:val="Heading2"/>
@@ -4190,8 +4277,8 @@
         <w:t xml:space="preserve">inputs.</w:t>
       </w:r>
     </w:p>
-    <w:bookmarkEnd w:id="64"/>
-    <w:bookmarkStart w:id="68" w:name="Xbb45e3d72d9f06bc05a60bf2cd70c97a42b3785"/>
+    <w:bookmarkEnd w:id="67"/>
+    <w:bookmarkStart w:id="71" w:name="Xbb45e3d72d9f06bc05a60bf2cd70c97a42b3785"/>
     <w:p>
       <w:pPr>
         <w:pStyle w:val="Heading2"/>
@@ -4757,18 +4844,18 @@
           <wp:inline>
             <wp:extent cx="5334000" cy="5026925"/>
             <wp:effectExtent b="0" l="0" r="0" t="0"/>
-            <wp:docPr descr="How much the AI’s choice leans on diesel vs. the true optimum, per test-split scenario" title="" id="66" name="Picture"/>
+            <wp:docPr descr="How much the AI’s choice leans on diesel vs. the true optimum, per test-split scenario" title="" id="69" name="Picture"/>
             <a:graphic>
               <a:graphicData uri="http://schemas.openxmlformats.org/drawingml/2006/picture">
                 <pic:pic>
                   <pic:nvPicPr>
-                    <pic:cNvPr descr="../outputs/figures/26_lean_on_diesel_diagnostic.png" id="67" name="Picture"/>
+                    <pic:cNvPr descr="../outputs/figures/26_lean_on_diesel_diagnostic.png" id="70" name="Picture"/>
                     <pic:cNvPicPr>
                       <a:picLocks noChangeArrowheads="1" noChangeAspect="1"/>
                     </pic:cNvPicPr>
                   </pic:nvPicPr>
                   <pic:blipFill>
-                    <a:blip r:embed="rId65"/>
+                    <a:blip r:embed="rId68"/>
                     <a:stretch>
                       <a:fillRect/>
                     </a:stretch>
@@ -4869,8 +4956,8 @@
         <w:t xml:space="preserve">by a modest amount, not a large one.</w:t>
       </w:r>
     </w:p>
-    <w:bookmarkEnd w:id="68"/>
-    <w:bookmarkStart w:id="72" w:name="results-cost-sensitivity"/>
+    <w:bookmarkEnd w:id="71"/>
+    <w:bookmarkStart w:id="75" w:name="results-cost-sensitivity"/>
     <w:p>
       <w:pPr>
         <w:pStyle w:val="Heading2"/>
@@ -5183,18 +5270,18 @@
           <wp:inline>
             <wp:extent cx="5334000" cy="3784587"/>
             <wp:effectExtent b="0" l="0" r="0" t="0"/>
-            <wp:docPr descr="Optimal battery size shifts with battery cost — monotonic across all three price points" title="" id="70" name="Picture"/>
+            <wp:docPr descr="Optimal battery size shifts with battery cost — monotonic across all three price points" title="" id="73" name="Picture"/>
             <a:graphic>
               <a:graphicData uri="http://schemas.openxmlformats.org/drawingml/2006/picture">
                 <pic:pic>
                   <pic:nvPicPr>
-                    <pic:cNvPr descr="../outputs/figures/27_optimal_modules_by_cost.png" id="71" name="Picture"/>
+                    <pic:cNvPr descr="../outputs/figures/27_optimal_modules_by_cost.png" id="74" name="Picture"/>
                     <pic:cNvPicPr>
                       <a:picLocks noChangeArrowheads="1" noChangeAspect="1"/>
                     </pic:cNvPicPr>
                   </pic:nvPicPr>
                   <pic:blipFill>
-                    <a:blip r:embed="rId69"/>
+                    <a:blip r:embed="rId72"/>
                     <a:stretch>
                       <a:fillRect/>
                     </a:stretch>
@@ -5279,8 +5366,8 @@
         <w:t xml:space="preserve">battery cost assumption changed materially.</w:t>
       </w:r>
     </w:p>
-    <w:bookmarkEnd w:id="72"/>
-    <w:bookmarkStart w:id="76" w:name="computational-efficiency"/>
+    <w:bookmarkEnd w:id="75"/>
+    <w:bookmarkStart w:id="79" w:name="computational-efficiency"/>
     <w:p>
       <w:pPr>
         <w:pStyle w:val="Heading2"/>
@@ -5506,18 +5593,18 @@
           <wp:inline>
             <wp:extent cx="5334000" cy="3304467"/>
             <wp:effectExtent b="0" l="0" r="0" t="0"/>
-            <wp:docPr descr="Computational cost per scenario: mechanistic search vs. neural-network inference, single-call and batched (log scale)" title="" id="74" name="Picture"/>
+            <wp:docPr descr="Computational cost per scenario: mechanistic search vs. neural-network inference, single-call and batched (log scale)" title="" id="77" name="Picture"/>
             <a:graphic>
               <a:graphicData uri="http://schemas.openxmlformats.org/drawingml/2006/picture">
                 <pic:pic>
                   <pic:nvPicPr>
-                    <pic:cNvPr descr="../outputs/figures/28_computational_efficiency.png" id="75" name="Picture"/>
+                    <pic:cNvPr descr="../outputs/figures/28_computational_efficiency.png" id="78" name="Picture"/>
                     <pic:cNvPicPr>
                       <a:picLocks noChangeArrowheads="1" noChangeAspect="1"/>
                     </pic:cNvPicPr>
                   </pic:nvPicPr>
                   <pic:blipFill>
-                    <a:blip r:embed="rId73"/>
+                    <a:blip r:embed="rId76"/>
                     <a:stretch>
                       <a:fillRect/>
                     </a:stretch>
@@ -5698,8 +5785,8 @@
         <w:t xml:space="preserve">evaluating.</w:t>
       </w:r>
     </w:p>
-    <w:bookmarkEnd w:id="76"/>
-    <w:bookmarkStart w:id="77" w:name="discussion-and-limitations"/>
+    <w:bookmarkEnd w:id="79"/>
+    <w:bookmarkStart w:id="80" w:name="discussion-and-limitations"/>
     <w:p>
       <w:pPr>
         <w:pStyle w:val="Heading2"/>
@@ -5958,8 +6045,8 @@
         <w:t xml:space="preserve">over.</w:t>
       </w:r>
     </w:p>
-    <w:bookmarkEnd w:id="77"/>
-    <w:bookmarkStart w:id="78" w:name="conclusion"/>
+    <w:bookmarkEnd w:id="80"/>
+    <w:bookmarkStart w:id="81" w:name="conclusion"/>
     <w:p>
       <w:pPr>
         <w:pStyle w:val="Heading2"/>
@@ -6096,8 +6183,8 @@
         <w:t xml:space="preserve">target is conditioned on the battery cost assumption it was trained under.</w:t>
       </w:r>
     </w:p>
-    <w:bookmarkEnd w:id="78"/>
-    <w:bookmarkEnd w:id="79"/>
+    <w:bookmarkEnd w:id="81"/>
+    <w:bookmarkEnd w:id="82"/>
     <w:sectPr/>
   </w:body>
 </w:document>

</xml_diff>